<commit_message>
style: fixed table shading, margins, and borders across all 10 PDFs eliminating black boxes
</commit_message>
<xml_diff>
--- a/referencias/GUIONES/Guion_Dia10_El_Ultimo_Nivel.docx
+++ b/referencias/GUIONES/Guion_Dia10_El_Ultimo_Nivel.docx
@@ -364,26 +364,26 @@
         </w:trPr>
         <w:tc>
           <w:tcPr>
-            <w:shd w:fill="0a0e14" w:val="clear"/>
+            <w:vAlign w:val="center"/>
+            <w:shd w:fill="0F172A"/>
             <w:tcMar>
-              <w:top w:w="70.0" w:type="dxa"/>
-              <w:left w:w="110.0" w:type="dxa"/>
-              <w:bottom w:w="70.0" w:type="dxa"/>
-              <w:right w:w="110.0" w:type="dxa"/>
+              <w:top w:w="160" w:type="dxa"/>
+              <w:bottom w:w="160" w:type="dxa"/>
+              <w:left w:w="200" w:type="dxa"/>
+              <w:right w:w="200" w:type="dxa"/>
             </w:tcMar>
-            <w:vAlign w:val="center"/>
           </w:tcPr>
           <w:p>
             <w:pPr>
-              <w:spacing w:after="0" w:lineRule="auto"/>
+              <w:spacing w:after="80" w:lineRule="auto" w:before="80"/>
               <w:rPr/>
             </w:pPr>
             <w:r>
               <w:rPr>
                 <w:rFonts w:ascii="Arial" w:cs="Arial" w:eastAsia="Arial" w:hAnsi="Arial"/>
-                <w:b w:val="1"/>
+                <w:b/>
                 <w:bCs w:val="1"/>
-                <w:color w:val="ffffff"/>
+                <w:color w:val="FFFFFF"/>
                 <w:sz w:val="18"/>
                 <w:szCs w:val="18"/>
                 <w:rtl w:val="0"/>
@@ -392,6 +392,8 @@
             </w:r>
             <w:r>
               <w:rPr>
+                <w:b/>
+                <w:color w:val="FFFFFF"/>
                 <w:rtl w:val="0"/>
               </w:rPr>
             </w:r>
@@ -399,26 +401,26 @@
         </w:tc>
         <w:tc>
           <w:tcPr>
-            <w:shd w:fill="0a0e14" w:val="clear"/>
+            <w:vAlign w:val="center"/>
+            <w:shd w:fill="0F172A"/>
             <w:tcMar>
-              <w:top w:w="70.0" w:type="dxa"/>
-              <w:left w:w="110.0" w:type="dxa"/>
-              <w:bottom w:w="70.0" w:type="dxa"/>
-              <w:right w:w="110.0" w:type="dxa"/>
+              <w:top w:w="160" w:type="dxa"/>
+              <w:bottom w:w="160" w:type="dxa"/>
+              <w:left w:w="200" w:type="dxa"/>
+              <w:right w:w="200" w:type="dxa"/>
             </w:tcMar>
-            <w:vAlign w:val="center"/>
           </w:tcPr>
           <w:p>
             <w:pPr>
-              <w:spacing w:after="0" w:lineRule="auto"/>
+              <w:spacing w:after="80" w:lineRule="auto" w:before="80"/>
               <w:rPr/>
             </w:pPr>
             <w:r>
               <w:rPr>
                 <w:rFonts w:ascii="Arial" w:cs="Arial" w:eastAsia="Arial" w:hAnsi="Arial"/>
-                <w:b w:val="1"/>
+                <w:b/>
                 <w:bCs w:val="1"/>
-                <w:color w:val="ffffff"/>
+                <w:color w:val="FFFFFF"/>
                 <w:sz w:val="18"/>
                 <w:szCs w:val="18"/>
                 <w:rtl w:val="0"/>
@@ -427,6 +429,8 @@
             </w:r>
             <w:r>
               <w:rPr>
+                <w:b/>
+                <w:color w:val="FFFFFF"/>
                 <w:rtl w:val="0"/>
               </w:rPr>
             </w:r>
@@ -434,26 +438,26 @@
         </w:tc>
         <w:tc>
           <w:tcPr>
-            <w:shd w:fill="0a0e14" w:val="clear"/>
+            <w:vAlign w:val="center"/>
+            <w:shd w:fill="0F172A"/>
             <w:tcMar>
-              <w:top w:w="70.0" w:type="dxa"/>
-              <w:left w:w="110.0" w:type="dxa"/>
-              <w:bottom w:w="70.0" w:type="dxa"/>
-              <w:right w:w="110.0" w:type="dxa"/>
+              <w:top w:w="160" w:type="dxa"/>
+              <w:bottom w:w="160" w:type="dxa"/>
+              <w:left w:w="200" w:type="dxa"/>
+              <w:right w:w="200" w:type="dxa"/>
             </w:tcMar>
-            <w:vAlign w:val="center"/>
           </w:tcPr>
           <w:p>
             <w:pPr>
-              <w:spacing w:after="0" w:lineRule="auto"/>
+              <w:spacing w:after="80" w:lineRule="auto" w:before="80"/>
               <w:rPr/>
             </w:pPr>
             <w:r>
               <w:rPr>
                 <w:rFonts w:ascii="Arial" w:cs="Arial" w:eastAsia="Arial" w:hAnsi="Arial"/>
-                <w:b w:val="1"/>
+                <w:b/>
                 <w:bCs w:val="1"/>
-                <w:color w:val="ffffff"/>
+                <w:color w:val="FFFFFF"/>
                 <w:sz w:val="18"/>
                 <w:szCs w:val="18"/>
                 <w:rtl w:val="0"/>
@@ -462,6 +466,8 @@
             </w:r>
             <w:r>
               <w:rPr>
+                <w:b/>
+                <w:color w:val="FFFFFF"/>
                 <w:rtl w:val="0"/>
               </w:rPr>
             </w:r>
@@ -469,26 +475,26 @@
         </w:tc>
         <w:tc>
           <w:tcPr>
-            <w:shd w:fill="0a0e14" w:val="clear"/>
+            <w:vAlign w:val="center"/>
+            <w:shd w:fill="0F172A"/>
             <w:tcMar>
-              <w:top w:w="70.0" w:type="dxa"/>
-              <w:left w:w="110.0" w:type="dxa"/>
-              <w:bottom w:w="70.0" w:type="dxa"/>
-              <w:right w:w="110.0" w:type="dxa"/>
+              <w:top w:w="160" w:type="dxa"/>
+              <w:bottom w:w="160" w:type="dxa"/>
+              <w:left w:w="200" w:type="dxa"/>
+              <w:right w:w="200" w:type="dxa"/>
             </w:tcMar>
-            <w:vAlign w:val="center"/>
           </w:tcPr>
           <w:p>
             <w:pPr>
-              <w:spacing w:after="0" w:lineRule="auto"/>
+              <w:spacing w:after="80" w:lineRule="auto" w:before="80"/>
               <w:rPr/>
             </w:pPr>
             <w:r>
               <w:rPr>
                 <w:rFonts w:ascii="Arial" w:cs="Arial" w:eastAsia="Arial" w:hAnsi="Arial"/>
-                <w:b w:val="1"/>
+                <w:b/>
                 <w:bCs w:val="1"/>
-                <w:color w:val="ffffff"/>
+                <w:color w:val="FFFFFF"/>
                 <w:sz w:val="18"/>
                 <w:szCs w:val="18"/>
                 <w:rtl w:val="0"/>
@@ -497,6 +503,8 @@
             </w:r>
             <w:r>
               <w:rPr>
+                <w:b/>
+                <w:color w:val="FFFFFF"/>
                 <w:rtl w:val="0"/>
               </w:rPr>
             </w:r>
@@ -656,14 +664,14 @@
         </w:trPr>
         <w:tc>
           <w:tcPr>
-            <w:shd w:fill="f2f5f9" w:val="clear"/>
+            <w:vAlign w:val="center"/>
+            <w:shd w:fill="F8FAFC"/>
             <w:tcMar>
-              <w:top w:w="70.0" w:type="dxa"/>
-              <w:left w:w="110.0" w:type="dxa"/>
-              <w:bottom w:w="70.0" w:type="dxa"/>
-              <w:right w:w="110.0" w:type="dxa"/>
+              <w:top w:w="100" w:type="dxa"/>
+              <w:bottom w:w="100" w:type="dxa"/>
+              <w:left w:w="140" w:type="dxa"/>
+              <w:right w:w="140" w:type="dxa"/>
             </w:tcMar>
-            <w:vAlign w:val="center"/>
           </w:tcPr>
           <w:p>
             <w:pPr>
@@ -691,14 +699,14 @@
         </w:tc>
         <w:tc>
           <w:tcPr>
-            <w:shd w:fill="f2f5f9" w:val="clear"/>
+            <w:vAlign w:val="center"/>
+            <w:shd w:fill="F8FAFC"/>
             <w:tcMar>
-              <w:top w:w="70.0" w:type="dxa"/>
-              <w:left w:w="110.0" w:type="dxa"/>
-              <w:bottom w:w="70.0" w:type="dxa"/>
-              <w:right w:w="110.0" w:type="dxa"/>
+              <w:top w:w="100" w:type="dxa"/>
+              <w:bottom w:w="100" w:type="dxa"/>
+              <w:left w:w="140" w:type="dxa"/>
+              <w:right w:w="140" w:type="dxa"/>
             </w:tcMar>
-            <w:vAlign w:val="center"/>
           </w:tcPr>
           <w:p>
             <w:pPr>
@@ -726,14 +734,14 @@
         </w:tc>
         <w:tc>
           <w:tcPr>
-            <w:shd w:fill="f2f5f9" w:val="clear"/>
+            <w:vAlign w:val="center"/>
+            <w:shd w:fill="F8FAFC"/>
             <w:tcMar>
-              <w:top w:w="70.0" w:type="dxa"/>
-              <w:left w:w="110.0" w:type="dxa"/>
-              <w:bottom w:w="70.0" w:type="dxa"/>
-              <w:right w:w="110.0" w:type="dxa"/>
+              <w:top w:w="100" w:type="dxa"/>
+              <w:bottom w:w="100" w:type="dxa"/>
+              <w:left w:w="140" w:type="dxa"/>
+              <w:right w:w="140" w:type="dxa"/>
             </w:tcMar>
-            <w:vAlign w:val="center"/>
           </w:tcPr>
           <w:p>
             <w:pPr>
@@ -761,14 +769,14 @@
         </w:tc>
         <w:tc>
           <w:tcPr>
-            <w:shd w:fill="f2f5f9" w:val="clear"/>
+            <w:vAlign w:val="center"/>
+            <w:shd w:fill="F8FAFC"/>
             <w:tcMar>
-              <w:top w:w="70.0" w:type="dxa"/>
-              <w:left w:w="110.0" w:type="dxa"/>
-              <w:bottom w:w="70.0" w:type="dxa"/>
-              <w:right w:w="110.0" w:type="dxa"/>
+              <w:top w:w="100" w:type="dxa"/>
+              <w:bottom w:w="100" w:type="dxa"/>
+              <w:left w:w="140" w:type="dxa"/>
+              <w:right w:w="140" w:type="dxa"/>
             </w:tcMar>
-            <w:vAlign w:val="center"/>
           </w:tcPr>
           <w:p>
             <w:pPr>
@@ -948,14 +956,14 @@
         </w:trPr>
         <w:tc>
           <w:tcPr>
-            <w:shd w:fill="f2f5f9" w:val="clear"/>
+            <w:vAlign w:val="center"/>
+            <w:shd w:fill="F8FAFC"/>
             <w:tcMar>
-              <w:top w:w="70.0" w:type="dxa"/>
-              <w:left w:w="110.0" w:type="dxa"/>
-              <w:bottom w:w="70.0" w:type="dxa"/>
-              <w:right w:w="110.0" w:type="dxa"/>
+              <w:top w:w="100" w:type="dxa"/>
+              <w:bottom w:w="100" w:type="dxa"/>
+              <w:left w:w="140" w:type="dxa"/>
+              <w:right w:w="140" w:type="dxa"/>
             </w:tcMar>
-            <w:vAlign w:val="center"/>
           </w:tcPr>
           <w:p>
             <w:pPr>
@@ -983,14 +991,14 @@
         </w:tc>
         <w:tc>
           <w:tcPr>
-            <w:shd w:fill="f2f5f9" w:val="clear"/>
+            <w:vAlign w:val="center"/>
+            <w:shd w:fill="F8FAFC"/>
             <w:tcMar>
-              <w:top w:w="70.0" w:type="dxa"/>
-              <w:left w:w="110.0" w:type="dxa"/>
-              <w:bottom w:w="70.0" w:type="dxa"/>
-              <w:right w:w="110.0" w:type="dxa"/>
+              <w:top w:w="100" w:type="dxa"/>
+              <w:bottom w:w="100" w:type="dxa"/>
+              <w:left w:w="140" w:type="dxa"/>
+              <w:right w:w="140" w:type="dxa"/>
             </w:tcMar>
-            <w:vAlign w:val="center"/>
           </w:tcPr>
           <w:p>
             <w:pPr>
@@ -1018,14 +1026,14 @@
         </w:tc>
         <w:tc>
           <w:tcPr>
-            <w:shd w:fill="f2f5f9" w:val="clear"/>
+            <w:vAlign w:val="center"/>
+            <w:shd w:fill="F8FAFC"/>
             <w:tcMar>
-              <w:top w:w="70.0" w:type="dxa"/>
-              <w:left w:w="110.0" w:type="dxa"/>
-              <w:bottom w:w="70.0" w:type="dxa"/>
-              <w:right w:w="110.0" w:type="dxa"/>
+              <w:top w:w="100" w:type="dxa"/>
+              <w:bottom w:w="100" w:type="dxa"/>
+              <w:left w:w="140" w:type="dxa"/>
+              <w:right w:w="140" w:type="dxa"/>
             </w:tcMar>
-            <w:vAlign w:val="center"/>
           </w:tcPr>
           <w:p>
             <w:pPr>
@@ -1053,14 +1061,14 @@
         </w:tc>
         <w:tc>
           <w:tcPr>
-            <w:shd w:fill="f2f5f9" w:val="clear"/>
+            <w:vAlign w:val="center"/>
+            <w:shd w:fill="F8FAFC"/>
             <w:tcMar>
-              <w:top w:w="70.0" w:type="dxa"/>
-              <w:left w:w="110.0" w:type="dxa"/>
-              <w:bottom w:w="70.0" w:type="dxa"/>
-              <w:right w:w="110.0" w:type="dxa"/>
+              <w:top w:w="100" w:type="dxa"/>
+              <w:bottom w:w="100" w:type="dxa"/>
+              <w:left w:w="140" w:type="dxa"/>
+              <w:right w:w="140" w:type="dxa"/>
             </w:tcMar>
-            <w:vAlign w:val="center"/>
           </w:tcPr>
           <w:p>
             <w:pPr>
@@ -1240,14 +1248,14 @@
         </w:trPr>
         <w:tc>
           <w:tcPr>
-            <w:shd w:fill="f2f5f9" w:val="clear"/>
+            <w:vAlign w:val="center"/>
+            <w:shd w:fill="F8FAFC"/>
             <w:tcMar>
-              <w:top w:w="70.0" w:type="dxa"/>
-              <w:left w:w="110.0" w:type="dxa"/>
-              <w:bottom w:w="70.0" w:type="dxa"/>
-              <w:right w:w="110.0" w:type="dxa"/>
+              <w:top w:w="100" w:type="dxa"/>
+              <w:bottom w:w="100" w:type="dxa"/>
+              <w:left w:w="140" w:type="dxa"/>
+              <w:right w:w="140" w:type="dxa"/>
             </w:tcMar>
-            <w:vAlign w:val="center"/>
           </w:tcPr>
           <w:p>
             <w:pPr>
@@ -1275,14 +1283,14 @@
         </w:tc>
         <w:tc>
           <w:tcPr>
-            <w:shd w:fill="f2f5f9" w:val="clear"/>
+            <w:vAlign w:val="center"/>
+            <w:shd w:fill="F8FAFC"/>
             <w:tcMar>
-              <w:top w:w="70.0" w:type="dxa"/>
-              <w:left w:w="110.0" w:type="dxa"/>
-              <w:bottom w:w="70.0" w:type="dxa"/>
-              <w:right w:w="110.0" w:type="dxa"/>
+              <w:top w:w="100" w:type="dxa"/>
+              <w:bottom w:w="100" w:type="dxa"/>
+              <w:left w:w="140" w:type="dxa"/>
+              <w:right w:w="140" w:type="dxa"/>
             </w:tcMar>
-            <w:vAlign w:val="center"/>
           </w:tcPr>
           <w:p>
             <w:pPr>
@@ -1310,14 +1318,14 @@
         </w:tc>
         <w:tc>
           <w:tcPr>
-            <w:shd w:fill="f2f5f9" w:val="clear"/>
+            <w:vAlign w:val="center"/>
+            <w:shd w:fill="F8FAFC"/>
             <w:tcMar>
-              <w:top w:w="70.0" w:type="dxa"/>
-              <w:left w:w="110.0" w:type="dxa"/>
-              <w:bottom w:w="70.0" w:type="dxa"/>
-              <w:right w:w="110.0" w:type="dxa"/>
+              <w:top w:w="100" w:type="dxa"/>
+              <w:bottom w:w="100" w:type="dxa"/>
+              <w:left w:w="140" w:type="dxa"/>
+              <w:right w:w="140" w:type="dxa"/>
             </w:tcMar>
-            <w:vAlign w:val="center"/>
           </w:tcPr>
           <w:p>
             <w:pPr>
@@ -1345,14 +1353,14 @@
         </w:tc>
         <w:tc>
           <w:tcPr>
-            <w:shd w:fill="f2f5f9" w:val="clear"/>
+            <w:vAlign w:val="center"/>
+            <w:shd w:fill="F8FAFC"/>
             <w:tcMar>
-              <w:top w:w="70.0" w:type="dxa"/>
-              <w:left w:w="110.0" w:type="dxa"/>
-              <w:bottom w:w="70.0" w:type="dxa"/>
-              <w:right w:w="110.0" w:type="dxa"/>
+              <w:top w:w="100" w:type="dxa"/>
+              <w:bottom w:w="100" w:type="dxa"/>
+              <w:left w:w="140" w:type="dxa"/>
+              <w:right w:w="140" w:type="dxa"/>
             </w:tcMar>
-            <w:vAlign w:val="center"/>
           </w:tcPr>
           <w:p>
             <w:pPr>
@@ -1618,25 +1626,25 @@
         </w:trPr>
         <w:tc>
           <w:tcPr>
-            <w:shd w:fill="0a0e14" w:val="clear"/>
+            <w:shd w:fill="0F172A"/>
             <w:tcMar>
-              <w:top w:w="90.0" w:type="dxa"/>
-              <w:left w:w="160.0" w:type="dxa"/>
-              <w:bottom w:w="90.0" w:type="dxa"/>
-              <w:right w:w="160.0" w:type="dxa"/>
+              <w:top w:w="160" w:type="dxa"/>
+              <w:bottom w:w="160" w:type="dxa"/>
+              <w:left w:w="200" w:type="dxa"/>
+              <w:right w:w="200" w:type="dxa"/>
             </w:tcMar>
           </w:tcPr>
           <w:p>
             <w:pPr>
-              <w:spacing w:after="20" w:lineRule="auto"/>
+              <w:spacing w:after="80" w:lineRule="auto" w:before="80"/>
               <w:rPr/>
             </w:pPr>
             <w:r>
               <w:rPr>
                 <w:rFonts w:ascii="Arial Unicode MS" w:cs="Arial Unicode MS" w:eastAsia="Arial Unicode MS" w:hAnsi="Arial Unicode MS"/>
-                <w:b w:val="1"/>
+                <w:b/>
                 <w:bCs w:val="1"/>
-                <w:color w:val="9fb3c8"/>
+                <w:color w:val="FFFFFF"/>
                 <w:sz w:val="15"/>
                 <w:szCs w:val="15"/>
                 <w:rtl w:val="0"/>
@@ -1645,21 +1653,23 @@
             </w:r>
             <w:r>
               <w:rPr>
-                <w:rtl w:val="0"/>
-              </w:rPr>
-            </w:r>
-          </w:p>
-          <w:p>
-            <w:pPr>
-              <w:spacing w:after="0" w:lineRule="auto"/>
+                <w:b/>
+                <w:color w:val="FFFFFF"/>
+                <w:rtl w:val="0"/>
+              </w:rPr>
+            </w:r>
+          </w:p>
+          <w:p>
+            <w:pPr>
+              <w:spacing w:after="80" w:lineRule="auto" w:before="80"/>
               <w:rPr/>
             </w:pPr>
             <w:r>
               <w:rPr>
                 <w:rFonts w:ascii="Arial" w:cs="Arial" w:eastAsia="Arial" w:hAnsi="Arial"/>
-                <w:b w:val="1"/>
+                <w:b/>
                 <w:bCs w:val="1"/>
-                <w:color w:val="ffffff"/>
+                <w:color w:val="FFFFFF"/>
                 <w:sz w:val="24"/>
                 <w:szCs w:val="24"/>
                 <w:rtl w:val="0"/>
@@ -1668,6 +1678,8 @@
             </w:r>
             <w:r>
               <w:rPr>
+                <w:b/>
+                <w:color w:val="FFFFFF"/>
                 <w:rtl w:val="0"/>
               </w:rPr>
             </w:r>
@@ -1768,12 +1780,12 @@
               <w:bottom w:color="d9e8e0" w:space="0" w:sz="4" w:val="single"/>
               <w:right w:color="d9e8e0" w:space="0" w:sz="4" w:val="single"/>
             </w:tcBorders>
-            <w:shd w:fill="f0faf5" w:val="clear"/>
+            <w:shd w:fill="ECFDF5"/>
             <w:tcMar>
-              <w:top w:w="120.0" w:type="dxa"/>
-              <w:left w:w="180.0" w:type="dxa"/>
-              <w:bottom w:w="120.0" w:type="dxa"/>
-              <w:right w:w="180.0" w:type="dxa"/>
+              <w:top w:w="160" w:type="dxa"/>
+              <w:bottom w:w="160" w:type="dxa"/>
+              <w:left w:w="200" w:type="dxa"/>
+              <w:right w:w="200" w:type="dxa"/>
             </w:tcMar>
           </w:tcPr>
           <w:p>
@@ -1784,9 +1796,9 @@
             <w:r>
               <w:rPr>
                 <w:rFonts w:ascii="Arial" w:cs="Arial" w:eastAsia="Arial" w:hAnsi="Arial"/>
-                <w:b w:val="1"/>
+                <w:b/>
                 <w:bCs w:val="1"/>
-                <w:color w:val="0e8a5f"/>
+                <w:color w:val="064E3B"/>
                 <w:sz w:val="18"/>
                 <w:szCs w:val="18"/>
                 <w:rtl w:val="0"/>
@@ -1984,25 +1996,25 @@
         </w:trPr>
         <w:tc>
           <w:tcPr>
-            <w:shd w:fill="0a0e14" w:val="clear"/>
+            <w:shd w:fill="0F172A"/>
             <w:tcMar>
-              <w:top w:w="90.0" w:type="dxa"/>
-              <w:left w:w="160.0" w:type="dxa"/>
-              <w:bottom w:w="90.0" w:type="dxa"/>
-              <w:right w:w="160.0" w:type="dxa"/>
+              <w:top w:w="160" w:type="dxa"/>
+              <w:bottom w:w="160" w:type="dxa"/>
+              <w:left w:w="200" w:type="dxa"/>
+              <w:right w:w="200" w:type="dxa"/>
             </w:tcMar>
           </w:tcPr>
           <w:p>
             <w:pPr>
-              <w:spacing w:after="20" w:lineRule="auto"/>
+              <w:spacing w:after="80" w:lineRule="auto" w:before="80"/>
               <w:rPr/>
             </w:pPr>
             <w:r>
               <w:rPr>
                 <w:rFonts w:ascii="Arial Unicode MS" w:cs="Arial Unicode MS" w:eastAsia="Arial Unicode MS" w:hAnsi="Arial Unicode MS"/>
-                <w:b w:val="1"/>
+                <w:b/>
                 <w:bCs w:val="1"/>
-                <w:color w:val="9fb3c8"/>
+                <w:color w:val="FFFFFF"/>
                 <w:sz w:val="15"/>
                 <w:szCs w:val="15"/>
                 <w:rtl w:val="0"/>
@@ -2011,21 +2023,23 @@
             </w:r>
             <w:r>
               <w:rPr>
-                <w:rtl w:val="0"/>
-              </w:rPr>
-            </w:r>
-          </w:p>
-          <w:p>
-            <w:pPr>
-              <w:spacing w:after="0" w:lineRule="auto"/>
+                <w:b/>
+                <w:color w:val="FFFFFF"/>
+                <w:rtl w:val="0"/>
+              </w:rPr>
+            </w:r>
+          </w:p>
+          <w:p>
+            <w:pPr>
+              <w:spacing w:after="80" w:lineRule="auto" w:before="80"/>
               <w:rPr/>
             </w:pPr>
             <w:r>
               <w:rPr>
                 <w:rFonts w:ascii="Arial" w:cs="Arial" w:eastAsia="Arial" w:hAnsi="Arial"/>
-                <w:b w:val="1"/>
+                <w:b/>
                 <w:bCs w:val="1"/>
-                <w:color w:val="ffffff"/>
+                <w:color w:val="FFFFFF"/>
                 <w:sz w:val="24"/>
                 <w:szCs w:val="24"/>
                 <w:rtl w:val="0"/>
@@ -2034,6 +2048,8 @@
             </w:r>
             <w:r>
               <w:rPr>
+                <w:b/>
+                <w:color w:val="FFFFFF"/>
                 <w:rtl w:val="0"/>
               </w:rPr>
             </w:r>
@@ -2577,25 +2593,25 @@
         </w:trPr>
         <w:tc>
           <w:tcPr>
-            <w:shd w:fill="0a0e14" w:val="clear"/>
+            <w:shd w:fill="0F172A"/>
             <w:tcMar>
-              <w:top w:w="90.0" w:type="dxa"/>
-              <w:left w:w="160.0" w:type="dxa"/>
-              <w:bottom w:w="90.0" w:type="dxa"/>
-              <w:right w:w="160.0" w:type="dxa"/>
+              <w:top w:w="160" w:type="dxa"/>
+              <w:bottom w:w="160" w:type="dxa"/>
+              <w:left w:w="200" w:type="dxa"/>
+              <w:right w:w="200" w:type="dxa"/>
             </w:tcMar>
           </w:tcPr>
           <w:p>
             <w:pPr>
-              <w:spacing w:after="20" w:lineRule="auto"/>
+              <w:spacing w:after="80" w:lineRule="auto" w:before="80"/>
               <w:rPr/>
             </w:pPr>
             <w:r>
               <w:rPr>
                 <w:rFonts w:ascii="Arial Unicode MS" w:cs="Arial Unicode MS" w:eastAsia="Arial Unicode MS" w:hAnsi="Arial Unicode MS"/>
-                <w:b w:val="1"/>
+                <w:b/>
                 <w:bCs w:val="1"/>
-                <w:color w:val="9fb3c8"/>
+                <w:color w:val="FFFFFF"/>
                 <w:sz w:val="15"/>
                 <w:szCs w:val="15"/>
                 <w:rtl w:val="0"/>
@@ -2604,21 +2620,23 @@
             </w:r>
             <w:r>
               <w:rPr>
-                <w:rtl w:val="0"/>
-              </w:rPr>
-            </w:r>
-          </w:p>
-          <w:p>
-            <w:pPr>
-              <w:spacing w:after="0" w:lineRule="auto"/>
+                <w:b/>
+                <w:color w:val="FFFFFF"/>
+                <w:rtl w:val="0"/>
+              </w:rPr>
+            </w:r>
+          </w:p>
+          <w:p>
+            <w:pPr>
+              <w:spacing w:after="80" w:lineRule="auto" w:before="80"/>
               <w:rPr/>
             </w:pPr>
             <w:r>
               <w:rPr>
                 <w:rFonts w:ascii="Arial" w:cs="Arial" w:eastAsia="Arial" w:hAnsi="Arial"/>
-                <w:b w:val="1"/>
+                <w:b/>
                 <w:bCs w:val="1"/>
-                <w:color w:val="ffffff"/>
+                <w:color w:val="FFFFFF"/>
                 <w:sz w:val="24"/>
                 <w:szCs w:val="24"/>
                 <w:rtl w:val="0"/>
@@ -2627,6 +2645,8 @@
             </w:r>
             <w:r>
               <w:rPr>
+                <w:b/>
+                <w:color w:val="FFFFFF"/>
                 <w:rtl w:val="0"/>
               </w:rPr>
             </w:r>
@@ -2905,12 +2925,12 @@
               <w:bottom w:color="d9e8e0" w:space="0" w:sz="4" w:val="single"/>
               <w:right w:color="d9e8e0" w:space="0" w:sz="4" w:val="single"/>
             </w:tcBorders>
-            <w:shd w:fill="f0faf5" w:val="clear"/>
+            <w:shd w:fill="ECFDF5"/>
             <w:tcMar>
-              <w:top w:w="120.0" w:type="dxa"/>
-              <w:left w:w="180.0" w:type="dxa"/>
-              <w:bottom w:w="120.0" w:type="dxa"/>
-              <w:right w:w="180.0" w:type="dxa"/>
+              <w:top w:w="160" w:type="dxa"/>
+              <w:bottom w:w="160" w:type="dxa"/>
+              <w:left w:w="200" w:type="dxa"/>
+              <w:right w:w="200" w:type="dxa"/>
             </w:tcMar>
           </w:tcPr>
           <w:p>
@@ -2921,9 +2941,9 @@
             <w:r>
               <w:rPr>
                 <w:rFonts w:ascii="Arial" w:cs="Arial" w:eastAsia="Arial" w:hAnsi="Arial"/>
-                <w:b w:val="1"/>
+                <w:b/>
                 <w:bCs w:val="1"/>
-                <w:color w:val="0e8a5f"/>
+                <w:color w:val="064E3B"/>
                 <w:sz w:val="18"/>
                 <w:szCs w:val="18"/>
                 <w:rtl w:val="0"/>
@@ -3024,25 +3044,25 @@
         </w:trPr>
         <w:tc>
           <w:tcPr>
-            <w:shd w:fill="0a0e14" w:val="clear"/>
+            <w:shd w:fill="0F172A"/>
             <w:tcMar>
-              <w:top w:w="90.0" w:type="dxa"/>
-              <w:left w:w="160.0" w:type="dxa"/>
-              <w:bottom w:w="90.0" w:type="dxa"/>
-              <w:right w:w="160.0" w:type="dxa"/>
+              <w:top w:w="160" w:type="dxa"/>
+              <w:bottom w:w="160" w:type="dxa"/>
+              <w:left w:w="200" w:type="dxa"/>
+              <w:right w:w="200" w:type="dxa"/>
             </w:tcMar>
           </w:tcPr>
           <w:p>
             <w:pPr>
-              <w:spacing w:after="20" w:lineRule="auto"/>
+              <w:spacing w:after="80" w:lineRule="auto" w:before="80"/>
               <w:rPr/>
             </w:pPr>
             <w:r>
               <w:rPr>
                 <w:rFonts w:ascii="Arial Unicode MS" w:cs="Arial Unicode MS" w:eastAsia="Arial Unicode MS" w:hAnsi="Arial Unicode MS"/>
-                <w:b w:val="1"/>
+                <w:b/>
                 <w:bCs w:val="1"/>
-                <w:color w:val="9fb3c8"/>
+                <w:color w:val="FFFFFF"/>
                 <w:sz w:val="15"/>
                 <w:szCs w:val="15"/>
                 <w:rtl w:val="0"/>
@@ -3051,21 +3071,23 @@
             </w:r>
             <w:r>
               <w:rPr>
-                <w:rtl w:val="0"/>
-              </w:rPr>
-            </w:r>
-          </w:p>
-          <w:p>
-            <w:pPr>
-              <w:spacing w:after="0" w:lineRule="auto"/>
+                <w:b/>
+                <w:color w:val="FFFFFF"/>
+                <w:rtl w:val="0"/>
+              </w:rPr>
+            </w:r>
+          </w:p>
+          <w:p>
+            <w:pPr>
+              <w:spacing w:after="80" w:lineRule="auto" w:before="80"/>
               <w:rPr/>
             </w:pPr>
             <w:r>
               <w:rPr>
                 <w:rFonts w:ascii="Arial" w:cs="Arial" w:eastAsia="Arial" w:hAnsi="Arial"/>
-                <w:b w:val="1"/>
+                <w:b/>
                 <w:bCs w:val="1"/>
-                <w:color w:val="ffffff"/>
+                <w:color w:val="FFFFFF"/>
                 <w:sz w:val="24"/>
                 <w:szCs w:val="24"/>
                 <w:rtl w:val="0"/>
@@ -3074,6 +3096,8 @@
             </w:r>
             <w:r>
               <w:rPr>
+                <w:b/>
+                <w:color w:val="FFFFFF"/>
                 <w:rtl w:val="0"/>
               </w:rPr>
             </w:r>
@@ -3955,25 +3979,25 @@
         </w:trPr>
         <w:tc>
           <w:tcPr>
-            <w:shd w:fill="0a0e14" w:val="clear"/>
+            <w:shd w:fill="0F172A"/>
             <w:tcMar>
-              <w:top w:w="90.0" w:type="dxa"/>
-              <w:left w:w="160.0" w:type="dxa"/>
-              <w:bottom w:w="90.0" w:type="dxa"/>
-              <w:right w:w="160.0" w:type="dxa"/>
+              <w:top w:w="160" w:type="dxa"/>
+              <w:bottom w:w="160" w:type="dxa"/>
+              <w:left w:w="200" w:type="dxa"/>
+              <w:right w:w="200" w:type="dxa"/>
             </w:tcMar>
           </w:tcPr>
           <w:p>
             <w:pPr>
-              <w:spacing w:after="20" w:lineRule="auto"/>
+              <w:spacing w:after="80" w:lineRule="auto" w:before="80"/>
               <w:rPr/>
             </w:pPr>
             <w:r>
               <w:rPr>
                 <w:rFonts w:ascii="Arial Unicode MS" w:cs="Arial Unicode MS" w:eastAsia="Arial Unicode MS" w:hAnsi="Arial Unicode MS"/>
-                <w:b w:val="1"/>
+                <w:b/>
                 <w:bCs w:val="1"/>
-                <w:color w:val="9fb3c8"/>
+                <w:color w:val="FFFFFF"/>
                 <w:sz w:val="15"/>
                 <w:szCs w:val="15"/>
                 <w:rtl w:val="0"/>
@@ -3982,21 +4006,23 @@
             </w:r>
             <w:r>
               <w:rPr>
-                <w:rtl w:val="0"/>
-              </w:rPr>
-            </w:r>
-          </w:p>
-          <w:p>
-            <w:pPr>
-              <w:spacing w:after="0" w:lineRule="auto"/>
+                <w:b/>
+                <w:color w:val="FFFFFF"/>
+                <w:rtl w:val="0"/>
+              </w:rPr>
+            </w:r>
+          </w:p>
+          <w:p>
+            <w:pPr>
+              <w:spacing w:after="80" w:lineRule="auto" w:before="80"/>
               <w:rPr/>
             </w:pPr>
             <w:r>
               <w:rPr>
                 <w:rFonts w:ascii="Arial" w:cs="Arial" w:eastAsia="Arial" w:hAnsi="Arial"/>
-                <w:b w:val="1"/>
+                <w:b/>
                 <w:bCs w:val="1"/>
-                <w:color w:val="ffffff"/>
+                <w:color w:val="FFFFFF"/>
                 <w:sz w:val="24"/>
                 <w:szCs w:val="24"/>
                 <w:rtl w:val="0"/>
@@ -4005,6 +4031,8 @@
             </w:r>
             <w:r>
               <w:rPr>
+                <w:b/>
+                <w:color w:val="FFFFFF"/>
                 <w:rtl w:val="0"/>
               </w:rPr>
             </w:r>
@@ -4489,12 +4517,12 @@
               <w:bottom w:color="d9e8e0" w:space="0" w:sz="4" w:val="single"/>
               <w:right w:color="d9e8e0" w:space="0" w:sz="4" w:val="single"/>
             </w:tcBorders>
-            <w:shd w:fill="f0faf5" w:val="clear"/>
+            <w:shd w:fill="ECFDF5"/>
             <w:tcMar>
-              <w:top w:w="120.0" w:type="dxa"/>
-              <w:left w:w="180.0" w:type="dxa"/>
-              <w:bottom w:w="120.0" w:type="dxa"/>
-              <w:right w:w="180.0" w:type="dxa"/>
+              <w:top w:w="160" w:type="dxa"/>
+              <w:bottom w:w="160" w:type="dxa"/>
+              <w:left w:w="200" w:type="dxa"/>
+              <w:right w:w="200" w:type="dxa"/>
             </w:tcMar>
           </w:tcPr>
           <w:p>
@@ -4505,9 +4533,9 @@
             <w:r>
               <w:rPr>
                 <w:rFonts w:ascii="Arial" w:cs="Arial" w:eastAsia="Arial" w:hAnsi="Arial"/>
-                <w:b w:val="1"/>
+                <w:b/>
                 <w:bCs w:val="1"/>
-                <w:color w:val="0e8a5f"/>
+                <w:color w:val="064E3B"/>
                 <w:sz w:val="18"/>
                 <w:szCs w:val="18"/>
                 <w:rtl w:val="0"/>
@@ -4705,25 +4733,25 @@
         </w:trPr>
         <w:tc>
           <w:tcPr>
-            <w:shd w:fill="0a0e14" w:val="clear"/>
+            <w:shd w:fill="0F172A"/>
             <w:tcMar>
-              <w:top w:w="90.0" w:type="dxa"/>
-              <w:left w:w="160.0" w:type="dxa"/>
-              <w:bottom w:w="90.0" w:type="dxa"/>
-              <w:right w:w="160.0" w:type="dxa"/>
+              <w:top w:w="160" w:type="dxa"/>
+              <w:bottom w:w="160" w:type="dxa"/>
+              <w:left w:w="200" w:type="dxa"/>
+              <w:right w:w="200" w:type="dxa"/>
             </w:tcMar>
           </w:tcPr>
           <w:p>
             <w:pPr>
-              <w:spacing w:after="20" w:lineRule="auto"/>
+              <w:spacing w:after="80" w:lineRule="auto" w:before="80"/>
               <w:rPr/>
             </w:pPr>
             <w:r>
               <w:rPr>
                 <w:rFonts w:ascii="Arial Unicode MS" w:cs="Arial Unicode MS" w:eastAsia="Arial Unicode MS" w:hAnsi="Arial Unicode MS"/>
-                <w:b w:val="1"/>
+                <w:b/>
                 <w:bCs w:val="1"/>
-                <w:color w:val="9fb3c8"/>
+                <w:color w:val="FFFFFF"/>
                 <w:sz w:val="15"/>
                 <w:szCs w:val="15"/>
                 <w:rtl w:val="0"/>
@@ -4732,21 +4760,23 @@
             </w:r>
             <w:r>
               <w:rPr>
-                <w:rtl w:val="0"/>
-              </w:rPr>
-            </w:r>
-          </w:p>
-          <w:p>
-            <w:pPr>
-              <w:spacing w:after="0" w:lineRule="auto"/>
+                <w:b/>
+                <w:color w:val="FFFFFF"/>
+                <w:rtl w:val="0"/>
+              </w:rPr>
+            </w:r>
+          </w:p>
+          <w:p>
+            <w:pPr>
+              <w:spacing w:after="80" w:lineRule="auto" w:before="80"/>
               <w:rPr/>
             </w:pPr>
             <w:r>
               <w:rPr>
                 <w:rFonts w:ascii="Arial" w:cs="Arial" w:eastAsia="Arial" w:hAnsi="Arial"/>
-                <w:b w:val="1"/>
+                <w:b/>
                 <w:bCs w:val="1"/>
-                <w:color w:val="ffffff"/>
+                <w:color w:val="FFFFFF"/>
                 <w:sz w:val="24"/>
                 <w:szCs w:val="24"/>
                 <w:rtl w:val="0"/>
@@ -4755,6 +4785,8 @@
             </w:r>
             <w:r>
               <w:rPr>
+                <w:b/>
+                <w:color w:val="FFFFFF"/>
                 <w:rtl w:val="0"/>
               </w:rPr>
             </w:r>
@@ -5552,25 +5584,25 @@
         </w:trPr>
         <w:tc>
           <w:tcPr>
-            <w:shd w:fill="0a0e14" w:val="clear"/>
+            <w:shd w:fill="0F172A"/>
             <w:tcMar>
-              <w:top w:w="90.0" w:type="dxa"/>
-              <w:left w:w="160.0" w:type="dxa"/>
-              <w:bottom w:w="90.0" w:type="dxa"/>
-              <w:right w:w="160.0" w:type="dxa"/>
+              <w:top w:w="160" w:type="dxa"/>
+              <w:bottom w:w="160" w:type="dxa"/>
+              <w:left w:w="200" w:type="dxa"/>
+              <w:right w:w="200" w:type="dxa"/>
             </w:tcMar>
           </w:tcPr>
           <w:p>
             <w:pPr>
-              <w:spacing w:after="20" w:lineRule="auto"/>
+              <w:spacing w:after="80" w:lineRule="auto" w:before="80"/>
               <w:rPr/>
             </w:pPr>
             <w:r>
               <w:rPr>
                 <w:rFonts w:ascii="Arial Unicode MS" w:cs="Arial Unicode MS" w:eastAsia="Arial Unicode MS" w:hAnsi="Arial Unicode MS"/>
-                <w:b w:val="1"/>
+                <w:b/>
                 <w:bCs w:val="1"/>
-                <w:color w:val="9fb3c8"/>
+                <w:color w:val="FFFFFF"/>
                 <w:sz w:val="15"/>
                 <w:szCs w:val="15"/>
                 <w:rtl w:val="0"/>
@@ -5579,21 +5611,23 @@
             </w:r>
             <w:r>
               <w:rPr>
-                <w:rtl w:val="0"/>
-              </w:rPr>
-            </w:r>
-          </w:p>
-          <w:p>
-            <w:pPr>
-              <w:spacing w:after="0" w:lineRule="auto"/>
+                <w:b/>
+                <w:color w:val="FFFFFF"/>
+                <w:rtl w:val="0"/>
+              </w:rPr>
+            </w:r>
+          </w:p>
+          <w:p>
+            <w:pPr>
+              <w:spacing w:after="80" w:lineRule="auto" w:before="80"/>
               <w:rPr/>
             </w:pPr>
             <w:r>
               <w:rPr>
                 <w:rFonts w:ascii="Arial" w:cs="Arial" w:eastAsia="Arial" w:hAnsi="Arial"/>
-                <w:b w:val="1"/>
+                <w:b/>
                 <w:bCs w:val="1"/>
-                <w:color w:val="ffffff"/>
+                <w:color w:val="FFFFFF"/>
                 <w:sz w:val="24"/>
                 <w:szCs w:val="24"/>
                 <w:rtl w:val="0"/>
@@ -5602,6 +5636,8 @@
             </w:r>
             <w:r>
               <w:rPr>
+                <w:b/>
+                <w:color w:val="FFFFFF"/>
                 <w:rtl w:val="0"/>
               </w:rPr>
             </w:r>

</xml_diff>